<commit_message>
docs: add project changes
</commit_message>
<xml_diff>
--- a/docs/Testing.docx
+++ b/docs/Testing.docx
@@ -1863,6 +1863,7 @@
           <w:rFonts w:ascii="Courier New" w:eastAsia="Times New Roman" w:hAnsi="Courier New" w:cs="Courier New"/>
           <w:b/>
           <w:bCs/>
+          <w:noProof/>
           <w:color w:val="000000"/>
           <w:sz w:val="18"/>
           <w:szCs w:val="18"/>
@@ -2043,6 +2044,7 @@
       <w:r>
         <w:rPr>
           <w:rFonts w:ascii="Courier New" w:eastAsia="Times New Roman" w:hAnsi="Courier New" w:cs="Courier New"/>
+          <w:noProof/>
           <w:color w:val="000000"/>
           <w:sz w:val="18"/>
           <w:szCs w:val="18"/>
@@ -2168,6 +2170,7 @@
       <w:r>
         <w:rPr>
           <w:rFonts w:ascii="Courier New" w:eastAsia="Times New Roman" w:hAnsi="Courier New" w:cs="Courier New"/>
+          <w:noProof/>
           <w:color w:val="000000"/>
           <w:sz w:val="18"/>
           <w:szCs w:val="18"/>
@@ -2308,6 +2311,7 @@
       <w:r>
         <w:rPr>
           <w:rFonts w:ascii="Courier New" w:eastAsia="Times New Roman" w:hAnsi="Courier New" w:cs="Courier New"/>
+          <w:noProof/>
           <w:color w:val="000000"/>
           <w:sz w:val="18"/>
           <w:szCs w:val="18"/>
@@ -2349,6 +2353,264 @@
           </wp:inline>
         </w:drawing>
       </w:r>
+    </w:p>
+    <w:p>
+      <w:pPr>
+        <w:shd w:val="clear" w:color="auto" w:fill="FFFFFE"/>
+        <w:spacing w:line="270" w:lineRule="atLeast"/>
+        <w:rPr>
+          <w:rFonts w:ascii="Courier New" w:eastAsia="Times New Roman" w:hAnsi="Courier New" w:cs="Courier New"/>
+          <w:color w:val="000000"/>
+          <w:sz w:val="18"/>
+          <w:szCs w:val="18"/>
+          <w:lang w:eastAsia="es-PE"/>
+        </w:rPr>
+      </w:pPr>
+    </w:p>
+    <w:p>
+      <w:pPr>
+        <w:shd w:val="clear" w:color="auto" w:fill="FFFFFE"/>
+        <w:spacing w:line="270" w:lineRule="atLeast"/>
+        <w:rPr>
+          <w:rFonts w:ascii="Courier New" w:eastAsia="Times New Roman" w:hAnsi="Courier New" w:cs="Courier New"/>
+          <w:b/>
+          <w:bCs/>
+          <w:color w:val="000000"/>
+          <w:sz w:val="18"/>
+          <w:szCs w:val="18"/>
+          <w:lang w:eastAsia="es-PE"/>
+        </w:rPr>
+      </w:pPr>
+      <w:r>
+        <w:rPr>
+          <w:rFonts w:ascii="Courier New" w:eastAsia="Times New Roman" w:hAnsi="Courier New" w:cs="Courier New"/>
+          <w:b/>
+          <w:bCs/>
+          <w:color w:val="000000"/>
+          <w:sz w:val="18"/>
+          <w:szCs w:val="18"/>
+          <w:lang w:eastAsia="es-PE"/>
+        </w:rPr>
+        <w:t>Pruebas con resilence4j</w:t>
+      </w:r>
+    </w:p>
+    <w:p>
+      <w:pPr>
+        <w:shd w:val="clear" w:color="auto" w:fill="FFFFFE"/>
+        <w:spacing w:line="270" w:lineRule="atLeast"/>
+        <w:rPr>
+          <w:rFonts w:ascii="Helvetica" w:hAnsi="Helvetica" w:cs="Helvetica"/>
+          <w:color w:val="212121"/>
+          <w:sz w:val="18"/>
+          <w:szCs w:val="18"/>
+          <w:shd w:val="clear" w:color="auto" w:fill="FFFFFF"/>
+        </w:rPr>
+      </w:pPr>
+      <w:r>
+        <w:rPr>
+          <w:rFonts w:ascii="Courier New" w:eastAsia="Times New Roman" w:hAnsi="Courier New" w:cs="Courier New"/>
+          <w:color w:val="000000"/>
+          <w:sz w:val="18"/>
+          <w:szCs w:val="18"/>
+          <w:lang w:eastAsia="es-PE"/>
+        </w:rPr>
+        <w:t xml:space="preserve">GET </w:t>
+      </w:r>
+      <w:hyperlink r:id="rId23" w:history="1">
+        <w:r>
+          <w:rPr>
+            <w:rStyle w:val="Hipervnculo"/>
+            <w:rFonts w:ascii="Helvetica" w:hAnsi="Helvetica" w:cs="Helvetica"/>
+            <w:sz w:val="18"/>
+            <w:szCs w:val="18"/>
+            <w:shd w:val="clear" w:color="auto" w:fill="FFFFFF"/>
+          </w:rPr>
+          <w:t>http://localhost:808</w:t>
+        </w:r>
+        <w:r>
+          <w:rPr>
+            <w:rStyle w:val="Hipervnculo"/>
+            <w:rFonts w:ascii="Helvetica" w:hAnsi="Helvetica" w:cs="Helvetica"/>
+            <w:sz w:val="18"/>
+            <w:szCs w:val="18"/>
+            <w:shd w:val="clear" w:color="auto" w:fill="FFFFFF"/>
+          </w:rPr>
+          <w:t>2</w:t>
+        </w:r>
+        <w:r>
+          <w:rPr>
+            <w:rStyle w:val="Hipervnculo"/>
+            <w:rFonts w:ascii="Helvetica" w:hAnsi="Helvetica" w:cs="Helvetica"/>
+            <w:sz w:val="18"/>
+            <w:szCs w:val="18"/>
+            <w:shd w:val="clear" w:color="auto" w:fill="FFFFFF"/>
+          </w:rPr>
+          <w:t>/api/transactions</w:t>
+        </w:r>
+      </w:hyperlink>
+    </w:p>
+    <w:p>
+      <w:pPr>
+        <w:shd w:val="clear" w:color="auto" w:fill="FFFFFE"/>
+        <w:spacing w:line="270" w:lineRule="atLeast"/>
+        <w:rPr>
+          <w:rFonts w:ascii="Courier New" w:eastAsia="Times New Roman" w:hAnsi="Courier New" w:cs="Courier New"/>
+          <w:color w:val="000000"/>
+          <w:sz w:val="18"/>
+          <w:szCs w:val="18"/>
+          <w:lang w:eastAsia="es-PE"/>
+        </w:rPr>
+      </w:pPr>
+      <w:r>
+        <w:rPr>
+          <w:rFonts w:ascii="Courier New" w:eastAsia="Times New Roman" w:hAnsi="Courier New" w:cs="Courier New"/>
+          <w:color w:val="000000"/>
+          <w:sz w:val="18"/>
+          <w:szCs w:val="18"/>
+          <w:lang w:eastAsia="es-PE"/>
+        </w:rPr>
+        <w:lastRenderedPageBreak/>
+        <w:drawing>
+          <wp:inline distT="0" distB="0" distL="0" distR="0" wp14:anchorId="17FE74B6" wp14:editId="4752FC37">
+            <wp:extent cx="5400040" cy="3051175"/>
+            <wp:effectExtent l="0" t="0" r="0" b="0"/>
+            <wp:docPr id="9" name="Imagen 9"/>
+            <wp:cNvGraphicFramePr>
+              <a:graphicFrameLocks xmlns:a="http://schemas.openxmlformats.org/drawingml/2006/main" noChangeAspect="1"/>
+            </wp:cNvGraphicFramePr>
+            <a:graphic xmlns:a="http://schemas.openxmlformats.org/drawingml/2006/main">
+              <a:graphicData uri="http://schemas.openxmlformats.org/drawingml/2006/picture">
+                <pic:pic xmlns:pic="http://schemas.openxmlformats.org/drawingml/2006/picture">
+                  <pic:nvPicPr>
+                    <pic:cNvPr id="1" name=""/>
+                    <pic:cNvPicPr/>
+                  </pic:nvPicPr>
+                  <pic:blipFill>
+                    <a:blip r:embed="rId24"/>
+                    <a:stretch>
+                      <a:fillRect/>
+                    </a:stretch>
+                  </pic:blipFill>
+                  <pic:spPr>
+                    <a:xfrm>
+                      <a:off x="0" y="0"/>
+                      <a:ext cx="5400040" cy="3051175"/>
+                    </a:xfrm>
+                    <a:prstGeom prst="rect">
+                      <a:avLst/>
+                    </a:prstGeom>
+                  </pic:spPr>
+                </pic:pic>
+              </a:graphicData>
+            </a:graphic>
+          </wp:inline>
+        </w:drawing>
+      </w:r>
+    </w:p>
+    <w:p>
+      <w:pPr>
+        <w:shd w:val="clear" w:color="auto" w:fill="FFFFFE"/>
+        <w:spacing w:line="270" w:lineRule="atLeast"/>
+        <w:rPr>
+          <w:rFonts w:ascii="Courier New" w:eastAsia="Times New Roman" w:hAnsi="Courier New" w:cs="Courier New"/>
+          <w:color w:val="000000"/>
+          <w:sz w:val="18"/>
+          <w:szCs w:val="18"/>
+          <w:lang w:eastAsia="es-PE"/>
+        </w:rPr>
+      </w:pPr>
+      <w:r>
+        <w:rPr>
+          <w:rFonts w:ascii="Courier New" w:eastAsia="Times New Roman" w:hAnsi="Courier New" w:cs="Courier New"/>
+          <w:color w:val="000000"/>
+          <w:sz w:val="18"/>
+          <w:szCs w:val="18"/>
+          <w:lang w:eastAsia="es-PE"/>
+        </w:rPr>
+        <w:drawing>
+          <wp:inline distT="0" distB="0" distL="0" distR="0" wp14:anchorId="7FD1146F" wp14:editId="1D4D34CD">
+            <wp:extent cx="5400040" cy="582930"/>
+            <wp:effectExtent l="0" t="0" r="0" b="7620"/>
+            <wp:docPr id="13" name="Imagen 13"/>
+            <wp:cNvGraphicFramePr>
+              <a:graphicFrameLocks xmlns:a="http://schemas.openxmlformats.org/drawingml/2006/main" noChangeAspect="1"/>
+            </wp:cNvGraphicFramePr>
+            <a:graphic xmlns:a="http://schemas.openxmlformats.org/drawingml/2006/main">
+              <a:graphicData uri="http://schemas.openxmlformats.org/drawingml/2006/picture">
+                <pic:pic xmlns:pic="http://schemas.openxmlformats.org/drawingml/2006/picture">
+                  <pic:nvPicPr>
+                    <pic:cNvPr id="1" name=""/>
+                    <pic:cNvPicPr/>
+                  </pic:nvPicPr>
+                  <pic:blipFill>
+                    <a:blip r:embed="rId25"/>
+                    <a:stretch>
+                      <a:fillRect/>
+                    </a:stretch>
+                  </pic:blipFill>
+                  <pic:spPr>
+                    <a:xfrm>
+                      <a:off x="0" y="0"/>
+                      <a:ext cx="5400040" cy="582930"/>
+                    </a:xfrm>
+                    <a:prstGeom prst="rect">
+                      <a:avLst/>
+                    </a:prstGeom>
+                  </pic:spPr>
+                </pic:pic>
+              </a:graphicData>
+            </a:graphic>
+          </wp:inline>
+        </w:drawing>
+      </w:r>
+    </w:p>
+    <w:p>
+      <w:pPr>
+        <w:shd w:val="clear" w:color="auto" w:fill="FFFFFE"/>
+        <w:spacing w:line="270" w:lineRule="atLeast"/>
+        <w:rPr>
+          <w:rFonts w:ascii="Courier New" w:eastAsia="Times New Roman" w:hAnsi="Courier New" w:cs="Courier New"/>
+          <w:color w:val="000000"/>
+          <w:sz w:val="18"/>
+          <w:szCs w:val="18"/>
+          <w:lang w:eastAsia="es-PE"/>
+        </w:rPr>
+      </w:pPr>
+      <w:r>
+        <w:rPr>
+          <w:rFonts w:ascii="Courier New" w:eastAsia="Times New Roman" w:hAnsi="Courier New" w:cs="Courier New"/>
+          <w:color w:val="000000"/>
+          <w:sz w:val="18"/>
+          <w:szCs w:val="18"/>
+          <w:lang w:eastAsia="es-PE"/>
+        </w:rPr>
+        <w:t xml:space="preserve">Apago </w:t>
+      </w:r>
+      <w:proofErr w:type="spellStart"/>
+      <w:r>
+        <w:rPr>
+          <w:rFonts w:ascii="Courier New" w:eastAsia="Times New Roman" w:hAnsi="Courier New" w:cs="Courier New"/>
+          <w:color w:val="000000"/>
+          <w:sz w:val="18"/>
+          <w:szCs w:val="18"/>
+          <w:lang w:eastAsia="es-PE"/>
+        </w:rPr>
+        <w:t>transaction-service</w:t>
+      </w:r>
+      <w:proofErr w:type="spellEnd"/>
+    </w:p>
+    <w:p>
+      <w:pPr>
+        <w:shd w:val="clear" w:color="auto" w:fill="FFFFFE"/>
+        <w:spacing w:line="270" w:lineRule="atLeast"/>
+        <w:rPr>
+          <w:rFonts w:ascii="Courier New" w:eastAsia="Times New Roman" w:hAnsi="Courier New" w:cs="Courier New"/>
+          <w:color w:val="000000"/>
+          <w:sz w:val="18"/>
+          <w:szCs w:val="18"/>
+          <w:lang w:eastAsia="es-PE"/>
+        </w:rPr>
+      </w:pPr>
     </w:p>
     <w:sectPr>
       <w:pgSz w:w="11906" w:h="16838"/>

</xml_diff>